<commit_message>
Kim11-2-4-Tepkime-Orani: gorsel alanlarina Shutter onizlemeleri yerlestirildi (2.3 bicimi)
</commit_message>
<xml_diff>
--- a/Kim11-2-4-Tepkime-Orani.docx
+++ b/Kim11-2-4-Tepkime-Orani.docx
@@ -146,77 +146,60 @@
           <w:tcPr>
             <w:tcW w:w="4500" w:type="dxa"/>
           </w:tcPr>
-          <w:tbl>
-            <w:tblPr>
-              <w:tblW w:w="4300" w:type="dxa"/>
+          <w:p>
+            <w:pPr>
               <w:jc w:val="center"/>
-              <w:tblBorders>
-                <w:top w:val="single" w:sz="8" w:space="0" w:color="7F7F7F"/>
-                <w:left w:val="single" w:sz="8" w:space="0" w:color="7F7F7F"/>
-                <w:bottom w:val="single" w:sz="8" w:space="0" w:color="7F7F7F"/>
-                <w:right w:val="single" w:sz="8" w:space="0" w:color="7F7F7F"/>
-              </w:tblBorders>
-            </w:tblPr>
-            <w:tblGrid>
-              <w:gridCol w:w="4300"/>
-            </w:tblGrid>
-            <w:tr>
-              <w:tc>
-                <w:tcPr>
-                  <w:tcW w:w="4300" w:type="dxa"/>
-                  <w:shd w:val="clear" w:color="auto" w:fill="EDEDED"/>
-                </w:tcPr>
-                <w:p>
-                  <w:pPr>
-                    <w:jc w:val="both"/>
-                    <w:rPr>
-                      <w:rFonts w:ascii="Times New Roman" w:hAnsi="Times New Roman" w:cs="Times New Roman"/>
-                      <w:lang w:val="tr-TR"/>
-                    </w:rPr>
-                  </w:pPr>
-                  <w:r>
-                    <w:rPr>
-                      <w:rFonts w:ascii="Times New Roman" w:hAnsi="Times New Roman" w:cs="Times New Roman"/>
-                      <w:lang w:val="tr-TR"/>
-                    </w:rPr>
-                    <w:t xml:space="preserve">GÖRSEL ALANI (Shutterstock)</w:t>
-                  </w:r>
-                </w:p>
-                <w:p>
-                  <w:pPr>
-                    <w:jc w:val="both"/>
-                    <w:rPr>
-                      <w:rFonts w:ascii="Times New Roman" w:hAnsi="Times New Roman" w:cs="Times New Roman"/>
-                      <w:lang w:val="tr-TR"/>
-                    </w:rPr>
-                  </w:pPr>
-                  <w:r>
-                    <w:rPr>
-                      <w:rFonts w:ascii="Times New Roman" w:hAnsi="Times New Roman" w:cs="Times New Roman"/>
-                      <w:lang w:val="tr-TR"/>
-                    </w:rPr>
-                    <w:t xml:space="preserve">Tarif: Çizgileri belirgin, araçsız, geniş bir açık otopark.</w:t>
-                  </w:r>
-                </w:p>
-                <w:p>
-                  <w:pPr>
-                    <w:jc w:val="both"/>
-                    <w:rPr>
-                      <w:rFonts w:ascii="Times New Roman" w:hAnsi="Times New Roman" w:cs="Times New Roman"/>
-                      <w:lang w:val="tr-TR"/>
-                    </w:rPr>
-                  </w:pPr>
-                  <w:r>
-                    <w:rPr>
-                      <w:rFonts w:ascii="Times New Roman" w:hAnsi="Times New Roman" w:cs="Times New Roman"/>
-                      <w:lang w:val="tr-TR"/>
-                    </w:rPr>
-                    <w:t xml:space="preserve">Shutter ID: 2734182717 (fotoğraf) — Wide empty asphalt parking lot with white painted lines</w:t>
-                  </w:r>
-                </w:p>
-              </w:tc>
-            </w:tr>
-          </w:tbl>
+            </w:pPr>
+            <w:r>
+              <w:drawing>
+                <wp:inline xmlns:a="http://schemas.openxmlformats.org/drawingml/2006/main" xmlns:pic="http://schemas.openxmlformats.org/drawingml/2006/picture">
+                  <wp:extent cx="2664000" cy="1728048"/>
+                  <wp:docPr id="900007" name="Picture 900007"/>
+                  <wp:cNvGraphicFramePr>
+                    <a:graphicFrameLocks noChangeAspect="1"/>
+                  </wp:cNvGraphicFramePr>
+                  <a:graphic>
+                    <a:graphicData uri="http://schemas.openxmlformats.org/drawingml/2006/picture">
+                      <pic:pic>
+                        <pic:nvPicPr>
+                          <pic:cNvPr id="0" name="2734182717_d.jpg"/>
+                          <pic:cNvPicPr/>
+                        </pic:nvPicPr>
+                        <pic:blipFill>
+                          <a:blip r:embed="rId12"/>
+                          <a:stretch>
+                            <a:fillRect/>
+                          </a:stretch>
+                        </pic:blipFill>
+                        <pic:spPr>
+                          <a:xfrm>
+                            <a:off x="0" y="0"/>
+                            <a:ext cx="2664000" cy="1728048"/>
+                          </a:xfrm>
+                          <a:prstGeom prst="rect"/>
+                        </pic:spPr>
+                      </pic:pic>
+                    </a:graphicData>
+                  </a:graphic>
+                </wp:inline>
+              </w:drawing>
+            </w:r>
+          </w:p>
+          <w:p>
+            <w:pPr>
+              <w:jc w:val="center"/>
+            </w:pPr>
+            <w:r>
+              <w:rPr>
+                <w:rFonts w:ascii="Times New Roman" w:hAnsi="Times New Roman" w:cs="Times New Roman"/>
+                <w:b/>
+                <w:bCs/>
+                <w:highlight w:val="yellow"/>
+                <w:lang w:val="tr-TR"/>
+              </w:rPr>
+              <w:t xml:space="preserve">Shutter id: 2734182717</w:t>
+            </w:r>
+          </w:p>
           <w:p>
             <w:pPr>
               <w:jc w:val="center"/>

</xml_diff>